<commit_message>
Show planning latency as box plots instead of a jittered strip plot
Co-Authored-By: Claude Opus 5.5 <noreply@anthropic.com>
</commit_message>
<xml_diff>
--- a/docs/paper/report.docx
+++ b/docs/paper/report.docx
@@ -9778,7 +9778,7 @@
       <w:r>
         <w:drawing>
           <wp:inline distT="0" distB="0" distL="0" distR="0">
-            <wp:extent cx="5762625" cy="1828800"/>
+            <wp:extent cx="5762625" cy="1571625"/>
             <wp:effectExtent t="0" r="0" b="0" l="0"/>
             <wp:docPr id="5" name=""/>
             <wp:cNvGraphicFramePr>
@@ -9803,7 +9803,7 @@
                   <pic:spPr bwMode="auto">
                     <a:xfrm>
                       <a:off x="0" y="0"/>
-                      <a:ext cx="5762625" cy="1828800"/>
+                      <a:ext cx="5762625" cy="1571625"/>
                     </a:xfrm>
                     <a:prstGeom prst="rect">
                       <a:avLst/>
@@ -9837,7 +9837,7 @@
           <w:sz w:val="20"/>
           <w:szCs w:val="20"/>
         </w:rPr>
-        <w:t xml:space="preserve">End-to-end planning latency of the three systems, log scale. Small points are individual plans; diamonds are medians.</w:t>
+        <w:t xml:space="preserve">End-to-end planning latency of the three systems, log scale. Boxes span the interquartile range with the median as a vertical line; whiskers extend to the most extreme plan within 1.5 interquartile ranges; points beyond them are plotted individually.</w:t>
       </w:r>
     </w:p>
     <w:p>
@@ -9850,7 +9850,7 @@
           <w:sz w:val="22"/>
           <w:szCs w:val="22"/>
         </w:rPr>
-        <w:t xml:space="preserve">For a controller, predictability matters as much as speed. The reference planner's plans spread over 200 ms and the optimised PyTorch planner's over 150 ms, with two distinct clusters. LeWM-MK's interquartile range is 0.7 ms wide, and its 90th percentile is within 0.6 ms of its median. One of its 76 plans took 458 ms, a one-off in a single process that the data do not explain; it is reported and kept. At the median, a LeWM-MK plan fits inside the 50 ms period of a 20 Hz control loop, and comfortably inside the 100 ms of a 10 Hz loop. The calls that only execute a planned action also became cheaper (0.82 ms), because the fused pipeline no longer runs the CPU image transform on every call.</w:t>
+        <w:t xml:space="preserve">For a controller, predictability matters as much as speed. The reference planner's plans spread over 200 ms and the optimised PyTorch planner's over 150 ms, including a separate group of plans near 115 ms that appear as outliers in Figure 5. LeWM-MK's interquartile range is 0.7 ms wide, and its 90th percentile is within 0.6 ms of its median. One of its 76 plans took 458 ms, a one-off in a single process that the data do not explain; it is reported and kept. At the median, a LeWM-MK plan fits inside the 50 ms period of a 20 Hz control loop, and comfortably inside the 100 ms of a 10 Hz loop. The calls that only execute a planned action also became cheaper (0.82 ms), because the fused pipeline no longer runs the CPU image transform on every call.</w:t>
       </w:r>
     </w:p>
     <w:p>

</xml_diff>